<commit_message>
Piece 1 errata resolved
</commit_message>
<xml_diff>
--- a/Working Folder/[To Edit] 1 Xie Xiang Ming 谢湘铭 - A Stroll in the Lion City 狮城漫步/1 Xie Xiang Ming 谢湘铭 - A Stroll in the Lion City 狮城漫步 - Errata_v1.docx
+++ b/Working Folder/[To Edit] 1 Xie Xiang Ming 谢湘铭 - A Stroll in the Lion City 狮城漫步/1 Xie Xiang Ming 谢湘铭 - A Stroll in the Lion City 狮城漫步 - Errata_v1.docx
@@ -1,6 +1,6 @@
 
 <file path=word/document.xml><?xml version="1.0" encoding="utf-8"?>
-<w:document xmlns:wpc="http://schemas.microsoft.com/office/word/2010/wordprocessingCanvas" xmlns:cx="http://schemas.microsoft.com/office/drawing/2014/chartex" xmlns:cx1="http://schemas.microsoft.com/office/drawing/2015/9/8/chartex" xmlns:cx2="http://schemas.microsoft.com/office/drawing/2015/10/21/chartex" xmlns:cx3="http://schemas.microsoft.com/office/drawing/2016/5/9/chartex" xmlns:cx4="http://schemas.microsoft.com/office/drawing/2016/5/10/chartex" xmlns:cx5="http://schemas.microsoft.com/office/drawing/2016/5/11/chartex" xmlns:cx6="http://schemas.microsoft.com/office/drawing/2016/5/12/chartex" xmlns:cx7="http://schemas.microsoft.com/office/drawing/2016/5/13/chartex" xmlns:cx8="http://schemas.microsoft.com/office/drawing/2016/5/14/chartex" xmlns:mc="http://schemas.openxmlformats.org/markup-compatibility/2006" xmlns:aink="http://schemas.microsoft.com/office/drawing/2016/ink" xmlns:am3d="http://schemas.microsoft.com/office/drawing/2017/model3d" xmlns:o="urn:schemas-microsoft-com:office:office" xmlns:r="http://schemas.openxmlformats.org/officeDocument/2006/relationships" xmlns:m="http://schemas.openxmlformats.org/officeDocument/2006/math" xmlns:v="urn:schemas-microsoft-com:vml" xmlns:wp14="http://schemas.microsoft.com/office/word/2010/wordprocessingDrawing" xmlns:wp="http://schemas.openxmlformats.org/drawingml/2006/wordprocessingDrawing" xmlns:w10="urn:schemas-microsoft-com:office:word" xmlns:w="http://schemas.openxmlformats.org/wordprocessingml/2006/main" xmlns:w14="http://schemas.microsoft.com/office/word/2010/wordml" xmlns:w15="http://schemas.microsoft.com/office/word/2012/wordml" xmlns:w16cid="http://schemas.microsoft.com/office/word/2016/wordml/cid" xmlns:w16se="http://schemas.microsoft.com/office/word/2015/wordml/symex" xmlns:wpg="http://schemas.microsoft.com/office/word/2010/wordprocessingGroup" xmlns:wpi="http://schemas.microsoft.com/office/word/2010/wordprocessingInk" xmlns:wne="http://schemas.microsoft.com/office/word/2006/wordml" xmlns:wps="http://schemas.microsoft.com/office/word/2010/wordprocessingShape" mc:Ignorable="w14 w15 w16se w16cid wp14">
+<w:document xmlns:wpc="http://schemas.microsoft.com/office/word/2010/wordprocessingCanvas" xmlns:cx="http://schemas.microsoft.com/office/drawing/2014/chartex" xmlns:cx1="http://schemas.microsoft.com/office/drawing/2015/9/8/chartex" xmlns:cx2="http://schemas.microsoft.com/office/drawing/2015/10/21/chartex" xmlns:cx3="http://schemas.microsoft.com/office/drawing/2016/5/9/chartex" xmlns:cx4="http://schemas.microsoft.com/office/drawing/2016/5/10/chartex" xmlns:cx5="http://schemas.microsoft.com/office/drawing/2016/5/11/chartex" xmlns:cx6="http://schemas.microsoft.com/office/drawing/2016/5/12/chartex" xmlns:cx7="http://schemas.microsoft.com/office/drawing/2016/5/13/chartex" xmlns:cx8="http://schemas.microsoft.com/office/drawing/2016/5/14/chartex" xmlns:mc="http://schemas.openxmlformats.org/markup-compatibility/2006" xmlns:aink="http://schemas.microsoft.com/office/drawing/2016/ink" xmlns:am3d="http://schemas.microsoft.com/office/drawing/2017/model3d" xmlns:o="urn:schemas-microsoft-com:office:office" xmlns:oel="http://schemas.microsoft.com/office/2019/extlst" xmlns:r="http://schemas.openxmlformats.org/officeDocument/2006/relationships" xmlns:m="http://schemas.openxmlformats.org/officeDocument/2006/math" xmlns:v="urn:schemas-microsoft-com:vml" xmlns:wp14="http://schemas.microsoft.com/office/word/2010/wordprocessingDrawing" xmlns:wp="http://schemas.openxmlformats.org/drawingml/2006/wordprocessingDrawing" xmlns:w10="urn:schemas-microsoft-com:office:word" xmlns:w="http://schemas.openxmlformats.org/wordprocessingml/2006/main" xmlns:w14="http://schemas.microsoft.com/office/word/2010/wordml" xmlns:w15="http://schemas.microsoft.com/office/word/2012/wordml" xmlns:w16cex="http://schemas.microsoft.com/office/word/2018/wordml/cex" xmlns:w16cid="http://schemas.microsoft.com/office/word/2016/wordml/cid" xmlns:w16="http://schemas.microsoft.com/office/word/2018/wordml" xmlns:w16du="http://schemas.microsoft.com/office/word/2023/wordml/word16du" xmlns:w16sdtdh="http://schemas.microsoft.com/office/word/2020/wordml/sdtdatahash" xmlns:w16se="http://schemas.microsoft.com/office/word/2015/wordml/symex" xmlns:wpg="http://schemas.microsoft.com/office/word/2010/wordprocessingGroup" xmlns:wpi="http://schemas.microsoft.com/office/word/2010/wordprocessingInk" xmlns:wne="http://schemas.microsoft.com/office/word/2006/wordml" xmlns:wps="http://schemas.microsoft.com/office/word/2010/wordprocessingShape" mc:Ignorable="w14 w15 w16se w16cid w16 w16cex w16sdtdh w16du wp14">
   <w:body>
     <w:p>
       <w:pPr>
@@ -793,16 +793,8 @@
               <w:rPr>
                 <w:rFonts w:ascii="Times" w:eastAsia="Times" w:hAnsi="Times" w:cs="Times" w:hint="eastAsia"/>
               </w:rPr>
-              <w:t xml:space="preserve"> </w:t>
-            </w:r>
-            <w:proofErr w:type="spellStart"/>
-            <w:r>
-              <w:rPr>
-                <w:rFonts w:ascii="Times" w:eastAsia="Times" w:hAnsi="Times" w:cs="Times" w:hint="eastAsia"/>
-              </w:rPr>
-              <w:t>Timp</w:t>
-            </w:r>
-            <w:proofErr w:type="spellEnd"/>
+              <w:t xml:space="preserve"> Timp</w:t>
+            </w:r>
             <w:r>
               <w:rPr>
                 <w:rFonts w:ascii="SimSun" w:hAnsi="SimSun" w:cs="SimSun" w:hint="eastAsia"/>
@@ -962,12 +954,6 @@
               </w:rPr>
               <w:t>渐强在哪里结束？</w:t>
             </w:r>
-            <w:r>
-              <w:rPr>
-                <w:rFonts w:ascii="Times" w:eastAsiaTheme="minorEastAsia" w:hAnsi="Times" w:cs="Times" w:hint="eastAsia"/>
-              </w:rPr>
-              <w:t xml:space="preserve"> </w:t>
-            </w:r>
           </w:p>
         </w:tc>
         <w:tc>
@@ -1127,7 +1113,7 @@
             <w:pPr>
               <w:jc w:val="center"/>
               <w:rPr>
-                <w:rFonts w:ascii="Times" w:eastAsia="Times" w:hAnsi="Times" w:cs="Times" w:hint="eastAsia"/>
+                <w:rFonts w:ascii="Times" w:eastAsia="Times" w:hAnsi="Times" w:cs="Times"/>
                 <w:color w:val="FF0000"/>
               </w:rPr>
             </w:pPr>
@@ -1179,8 +1165,6 @@
                 <w:color w:val="FF0000"/>
               </w:rPr>
             </w:pPr>
-            <w:bookmarkStart w:id="0" w:name="_GoBack"/>
-            <w:bookmarkEnd w:id="0"/>
           </w:p>
           <w:p>
             <w:pPr>
@@ -1350,7 +1334,7 @@
             <w:pPr>
               <w:jc w:val="center"/>
               <w:rPr>
-                <w:rFonts w:ascii="-webkit-standard" w:hAnsi="-webkit-standard"/>
+                <w:rFonts w:ascii="-webkit-standard" w:hAnsi="-webkit-standard" w:hint="eastAsia"/>
                 <w:color w:val="FF0000"/>
                 <w:szCs w:val="18"/>
               </w:rPr>
@@ -1540,7 +1524,7 @@
             <w:pPr>
               <w:jc w:val="center"/>
               <w:rPr>
-                <w:rFonts w:ascii="-webkit-standard" w:hAnsi="-webkit-standard"/>
+                <w:rFonts w:ascii="-webkit-standard" w:hAnsi="-webkit-standard" w:hint="eastAsia"/>
                 <w:color w:val="FF0000"/>
                 <w:szCs w:val="18"/>
               </w:rPr>
@@ -1861,7 +1845,7 @@
             <w:pPr>
               <w:jc w:val="center"/>
               <w:rPr>
-                <w:rFonts w:ascii="-webkit-standard" w:hAnsi="-webkit-standard"/>
+                <w:rFonts w:ascii="-webkit-standard" w:hAnsi="-webkit-standard" w:hint="eastAsia"/>
                 <w:color w:val="FF0000"/>
                 <w:szCs w:val="18"/>
               </w:rPr>
@@ -2023,7 +2007,7 @@
             <w:pPr>
               <w:jc w:val="center"/>
               <w:rPr>
-                <w:rFonts w:ascii="-webkit-standard" w:hAnsi="-webkit-standard"/>
+                <w:rFonts w:ascii="-webkit-standard" w:hAnsi="-webkit-standard" w:hint="eastAsia"/>
                 <w:color w:val="FF0000"/>
                 <w:szCs w:val="18"/>
               </w:rPr>
@@ -2075,7 +2059,7 @@
 </file>
 
 <file path=word/endnotes.xml><?xml version="1.0" encoding="utf-8"?>
-<w:endnotes xmlns:wpc="http://schemas.microsoft.com/office/word/2010/wordprocessingCanvas" xmlns:cx="http://schemas.microsoft.com/office/drawing/2014/chartex" xmlns:cx1="http://schemas.microsoft.com/office/drawing/2015/9/8/chartex" xmlns:cx2="http://schemas.microsoft.com/office/drawing/2015/10/21/chartex" xmlns:cx3="http://schemas.microsoft.com/office/drawing/2016/5/9/chartex" xmlns:cx4="http://schemas.microsoft.com/office/drawing/2016/5/10/chartex" xmlns:cx5="http://schemas.microsoft.com/office/drawing/2016/5/11/chartex" xmlns:cx6="http://schemas.microsoft.com/office/drawing/2016/5/12/chartex" xmlns:cx7="http://schemas.microsoft.com/office/drawing/2016/5/13/chartex" xmlns:cx8="http://schemas.microsoft.com/office/drawing/2016/5/14/chartex" xmlns:mc="http://schemas.openxmlformats.org/markup-compatibility/2006" xmlns:aink="http://schemas.microsoft.com/office/drawing/2016/ink" xmlns:am3d="http://schemas.microsoft.com/office/drawing/2017/model3d" xmlns:o="urn:schemas-microsoft-com:office:office" xmlns:r="http://schemas.openxmlformats.org/officeDocument/2006/relationships" xmlns:m="http://schemas.openxmlformats.org/officeDocument/2006/math" xmlns:v="urn:schemas-microsoft-com:vml" xmlns:wp14="http://schemas.microsoft.com/office/word/2010/wordprocessingDrawing" xmlns:wp="http://schemas.openxmlformats.org/drawingml/2006/wordprocessingDrawing" xmlns:w10="urn:schemas-microsoft-com:office:word" xmlns:w="http://schemas.openxmlformats.org/wordprocessingml/2006/main" xmlns:w14="http://schemas.microsoft.com/office/word/2010/wordml" xmlns:w15="http://schemas.microsoft.com/office/word/2012/wordml" xmlns:w16cid="http://schemas.microsoft.com/office/word/2016/wordml/cid" xmlns:w16se="http://schemas.microsoft.com/office/word/2015/wordml/symex" xmlns:wpg="http://schemas.microsoft.com/office/word/2010/wordprocessingGroup" xmlns:wpi="http://schemas.microsoft.com/office/word/2010/wordprocessingInk" xmlns:wne="http://schemas.microsoft.com/office/word/2006/wordml" xmlns:wps="http://schemas.microsoft.com/office/word/2010/wordprocessingShape" mc:Ignorable="w14 w15 w16se w16cid wp14">
+<w:endnotes xmlns:wpc="http://schemas.microsoft.com/office/word/2010/wordprocessingCanvas" xmlns:cx="http://schemas.microsoft.com/office/drawing/2014/chartex" xmlns:cx1="http://schemas.microsoft.com/office/drawing/2015/9/8/chartex" xmlns:cx2="http://schemas.microsoft.com/office/drawing/2015/10/21/chartex" xmlns:cx3="http://schemas.microsoft.com/office/drawing/2016/5/9/chartex" xmlns:cx4="http://schemas.microsoft.com/office/drawing/2016/5/10/chartex" xmlns:cx5="http://schemas.microsoft.com/office/drawing/2016/5/11/chartex" xmlns:cx6="http://schemas.microsoft.com/office/drawing/2016/5/12/chartex" xmlns:cx7="http://schemas.microsoft.com/office/drawing/2016/5/13/chartex" xmlns:cx8="http://schemas.microsoft.com/office/drawing/2016/5/14/chartex" xmlns:mc="http://schemas.openxmlformats.org/markup-compatibility/2006" xmlns:aink="http://schemas.microsoft.com/office/drawing/2016/ink" xmlns:am3d="http://schemas.microsoft.com/office/drawing/2017/model3d" xmlns:o="urn:schemas-microsoft-com:office:office" xmlns:oel="http://schemas.microsoft.com/office/2019/extlst" xmlns:r="http://schemas.openxmlformats.org/officeDocument/2006/relationships" xmlns:m="http://schemas.openxmlformats.org/officeDocument/2006/math" xmlns:v="urn:schemas-microsoft-com:vml" xmlns:wp14="http://schemas.microsoft.com/office/word/2010/wordprocessingDrawing" xmlns:wp="http://schemas.openxmlformats.org/drawingml/2006/wordprocessingDrawing" xmlns:w10="urn:schemas-microsoft-com:office:word" xmlns:w="http://schemas.openxmlformats.org/wordprocessingml/2006/main" xmlns:w14="http://schemas.microsoft.com/office/word/2010/wordml" xmlns:w15="http://schemas.microsoft.com/office/word/2012/wordml" xmlns:w16cex="http://schemas.microsoft.com/office/word/2018/wordml/cex" xmlns:w16cid="http://schemas.microsoft.com/office/word/2016/wordml/cid" xmlns:w16="http://schemas.microsoft.com/office/word/2018/wordml" xmlns:w16du="http://schemas.microsoft.com/office/word/2023/wordml/word16du" xmlns:w16sdtdh="http://schemas.microsoft.com/office/word/2020/wordml/sdtdatahash" xmlns:w16se="http://schemas.microsoft.com/office/word/2015/wordml/symex" xmlns:wpg="http://schemas.microsoft.com/office/word/2010/wordprocessingGroup" xmlns:wpi="http://schemas.microsoft.com/office/word/2010/wordprocessingInk" xmlns:wne="http://schemas.microsoft.com/office/word/2006/wordml" xmlns:wps="http://schemas.microsoft.com/office/word/2010/wordprocessingShape" mc:Ignorable="w14 w15 w16se w16cid w16 w16cex w16sdtdh w16du wp14">
   <w:endnote w:type="separator" w:id="-1">
     <w:p>
       <w:r>
@@ -2094,7 +2078,7 @@
 </file>
 
 <file path=word/footnotes.xml><?xml version="1.0" encoding="utf-8"?>
-<w:footnotes xmlns:wpc="http://schemas.microsoft.com/office/word/2010/wordprocessingCanvas" xmlns:cx="http://schemas.microsoft.com/office/drawing/2014/chartex" xmlns:cx1="http://schemas.microsoft.com/office/drawing/2015/9/8/chartex" xmlns:cx2="http://schemas.microsoft.com/office/drawing/2015/10/21/chartex" xmlns:cx3="http://schemas.microsoft.com/office/drawing/2016/5/9/chartex" xmlns:cx4="http://schemas.microsoft.com/office/drawing/2016/5/10/chartex" xmlns:cx5="http://schemas.microsoft.com/office/drawing/2016/5/11/chartex" xmlns:cx6="http://schemas.microsoft.com/office/drawing/2016/5/12/chartex" xmlns:cx7="http://schemas.microsoft.com/office/drawing/2016/5/13/chartex" xmlns:cx8="http://schemas.microsoft.com/office/drawing/2016/5/14/chartex" xmlns:mc="http://schemas.openxmlformats.org/markup-compatibility/2006" xmlns:aink="http://schemas.microsoft.com/office/drawing/2016/ink" xmlns:am3d="http://schemas.microsoft.com/office/drawing/2017/model3d" xmlns:o="urn:schemas-microsoft-com:office:office" xmlns:r="http://schemas.openxmlformats.org/officeDocument/2006/relationships" xmlns:m="http://schemas.openxmlformats.org/officeDocument/2006/math" xmlns:v="urn:schemas-microsoft-com:vml" xmlns:wp14="http://schemas.microsoft.com/office/word/2010/wordprocessingDrawing" xmlns:wp="http://schemas.openxmlformats.org/drawingml/2006/wordprocessingDrawing" xmlns:w10="urn:schemas-microsoft-com:office:word" xmlns:w="http://schemas.openxmlformats.org/wordprocessingml/2006/main" xmlns:w14="http://schemas.microsoft.com/office/word/2010/wordml" xmlns:w15="http://schemas.microsoft.com/office/word/2012/wordml" xmlns:w16cid="http://schemas.microsoft.com/office/word/2016/wordml/cid" xmlns:w16se="http://schemas.microsoft.com/office/word/2015/wordml/symex" xmlns:wpg="http://schemas.microsoft.com/office/word/2010/wordprocessingGroup" xmlns:wpi="http://schemas.microsoft.com/office/word/2010/wordprocessingInk" xmlns:wne="http://schemas.microsoft.com/office/word/2006/wordml" xmlns:wps="http://schemas.microsoft.com/office/word/2010/wordprocessingShape" mc:Ignorable="w14 w15 w16se w16cid wp14">
+<w:footnotes xmlns:wpc="http://schemas.microsoft.com/office/word/2010/wordprocessingCanvas" xmlns:cx="http://schemas.microsoft.com/office/drawing/2014/chartex" xmlns:cx1="http://schemas.microsoft.com/office/drawing/2015/9/8/chartex" xmlns:cx2="http://schemas.microsoft.com/office/drawing/2015/10/21/chartex" xmlns:cx3="http://schemas.microsoft.com/office/drawing/2016/5/9/chartex" xmlns:cx4="http://schemas.microsoft.com/office/drawing/2016/5/10/chartex" xmlns:cx5="http://schemas.microsoft.com/office/drawing/2016/5/11/chartex" xmlns:cx6="http://schemas.microsoft.com/office/drawing/2016/5/12/chartex" xmlns:cx7="http://schemas.microsoft.com/office/drawing/2016/5/13/chartex" xmlns:cx8="http://schemas.microsoft.com/office/drawing/2016/5/14/chartex" xmlns:mc="http://schemas.openxmlformats.org/markup-compatibility/2006" xmlns:aink="http://schemas.microsoft.com/office/drawing/2016/ink" xmlns:am3d="http://schemas.microsoft.com/office/drawing/2017/model3d" xmlns:o="urn:schemas-microsoft-com:office:office" xmlns:oel="http://schemas.microsoft.com/office/2019/extlst" xmlns:r="http://schemas.openxmlformats.org/officeDocument/2006/relationships" xmlns:m="http://schemas.openxmlformats.org/officeDocument/2006/math" xmlns:v="urn:schemas-microsoft-com:vml" xmlns:wp14="http://schemas.microsoft.com/office/word/2010/wordprocessingDrawing" xmlns:wp="http://schemas.openxmlformats.org/drawingml/2006/wordprocessingDrawing" xmlns:w10="urn:schemas-microsoft-com:office:word" xmlns:w="http://schemas.openxmlformats.org/wordprocessingml/2006/main" xmlns:w14="http://schemas.microsoft.com/office/word/2010/wordml" xmlns:w15="http://schemas.microsoft.com/office/word/2012/wordml" xmlns:w16cex="http://schemas.microsoft.com/office/word/2018/wordml/cex" xmlns:w16cid="http://schemas.microsoft.com/office/word/2016/wordml/cid" xmlns:w16="http://schemas.microsoft.com/office/word/2018/wordml" xmlns:w16du="http://schemas.microsoft.com/office/word/2023/wordml/word16du" xmlns:w16sdtdh="http://schemas.microsoft.com/office/word/2020/wordml/sdtdatahash" xmlns:w16se="http://schemas.microsoft.com/office/word/2015/wordml/symex" xmlns:wpg="http://schemas.microsoft.com/office/word/2010/wordprocessingGroup" xmlns:wpi="http://schemas.microsoft.com/office/word/2010/wordprocessingInk" xmlns:wne="http://schemas.microsoft.com/office/word/2006/wordml" xmlns:wps="http://schemas.microsoft.com/office/word/2010/wordprocessingShape" mc:Ignorable="w14 w15 w16se w16cid w16 w16cex w16sdtdh w16du wp14">
   <w:footnote w:type="separator" w:id="-1">
     <w:p>
       <w:r>
@@ -2113,7 +2097,7 @@
 </file>
 
 <file path=word/numbering.xml><?xml version="1.0" encoding="utf-8"?>
-<w:numbering xmlns:wpc="http://schemas.microsoft.com/office/word/2010/wordprocessingCanvas" xmlns:cx="http://schemas.microsoft.com/office/drawing/2014/chartex" xmlns:cx1="http://schemas.microsoft.com/office/drawing/2015/9/8/chartex" xmlns:cx2="http://schemas.microsoft.com/office/drawing/2015/10/21/chartex" xmlns:cx3="http://schemas.microsoft.com/office/drawing/2016/5/9/chartex" xmlns:cx4="http://schemas.microsoft.com/office/drawing/2016/5/10/chartex" xmlns:cx5="http://schemas.microsoft.com/office/drawing/2016/5/11/chartex" xmlns:cx6="http://schemas.microsoft.com/office/drawing/2016/5/12/chartex" xmlns:cx7="http://schemas.microsoft.com/office/drawing/2016/5/13/chartex" xmlns:cx8="http://schemas.microsoft.com/office/drawing/2016/5/14/chartex" xmlns:mc="http://schemas.openxmlformats.org/markup-compatibility/2006" xmlns:aink="http://schemas.microsoft.com/office/drawing/2016/ink" xmlns:am3d="http://schemas.microsoft.com/office/drawing/2017/model3d" xmlns:o="urn:schemas-microsoft-com:office:office" xmlns:r="http://schemas.openxmlformats.org/officeDocument/2006/relationships" xmlns:m="http://schemas.openxmlformats.org/officeDocument/2006/math" xmlns:v="urn:schemas-microsoft-com:vml" xmlns:wp14="http://schemas.microsoft.com/office/word/2010/wordprocessingDrawing" xmlns:wp="http://schemas.openxmlformats.org/drawingml/2006/wordprocessingDrawing" xmlns:w10="urn:schemas-microsoft-com:office:word" xmlns:w="http://schemas.openxmlformats.org/wordprocessingml/2006/main" xmlns:w14="http://schemas.microsoft.com/office/word/2010/wordml" xmlns:w15="http://schemas.microsoft.com/office/word/2012/wordml" xmlns:w16cid="http://schemas.microsoft.com/office/word/2016/wordml/cid" xmlns:w16se="http://schemas.microsoft.com/office/word/2015/wordml/symex" xmlns:wpg="http://schemas.microsoft.com/office/word/2010/wordprocessingGroup" xmlns:wpi="http://schemas.microsoft.com/office/word/2010/wordprocessingInk" xmlns:wne="http://schemas.microsoft.com/office/word/2006/wordml" xmlns:wps="http://schemas.microsoft.com/office/word/2010/wordprocessingShape" mc:Ignorable="w14 w15 w16se w16cid wp14">
+<w:numbering xmlns:wpc="http://schemas.microsoft.com/office/word/2010/wordprocessingCanvas" xmlns:cx="http://schemas.microsoft.com/office/drawing/2014/chartex" xmlns:cx1="http://schemas.microsoft.com/office/drawing/2015/9/8/chartex" xmlns:cx2="http://schemas.microsoft.com/office/drawing/2015/10/21/chartex" xmlns:cx3="http://schemas.microsoft.com/office/drawing/2016/5/9/chartex" xmlns:cx4="http://schemas.microsoft.com/office/drawing/2016/5/10/chartex" xmlns:cx5="http://schemas.microsoft.com/office/drawing/2016/5/11/chartex" xmlns:cx6="http://schemas.microsoft.com/office/drawing/2016/5/12/chartex" xmlns:cx7="http://schemas.microsoft.com/office/drawing/2016/5/13/chartex" xmlns:cx8="http://schemas.microsoft.com/office/drawing/2016/5/14/chartex" xmlns:mc="http://schemas.openxmlformats.org/markup-compatibility/2006" xmlns:aink="http://schemas.microsoft.com/office/drawing/2016/ink" xmlns:am3d="http://schemas.microsoft.com/office/drawing/2017/model3d" xmlns:o="urn:schemas-microsoft-com:office:office" xmlns:oel="http://schemas.microsoft.com/office/2019/extlst" xmlns:r="http://schemas.openxmlformats.org/officeDocument/2006/relationships" xmlns:m="http://schemas.openxmlformats.org/officeDocument/2006/math" xmlns:v="urn:schemas-microsoft-com:vml" xmlns:wp14="http://schemas.microsoft.com/office/word/2010/wordprocessingDrawing" xmlns:wp="http://schemas.openxmlformats.org/drawingml/2006/wordprocessingDrawing" xmlns:w10="urn:schemas-microsoft-com:office:word" xmlns:w="http://schemas.openxmlformats.org/wordprocessingml/2006/main" xmlns:w14="http://schemas.microsoft.com/office/word/2010/wordml" xmlns:w15="http://schemas.microsoft.com/office/word/2012/wordml" xmlns:w16cex="http://schemas.microsoft.com/office/word/2018/wordml/cex" xmlns:w16cid="http://schemas.microsoft.com/office/word/2016/wordml/cid" xmlns:w16="http://schemas.microsoft.com/office/word/2018/wordml" xmlns:w16du="http://schemas.microsoft.com/office/word/2023/wordml/word16du" xmlns:w16sdtdh="http://schemas.microsoft.com/office/word/2020/wordml/sdtdatahash" xmlns:w16se="http://schemas.microsoft.com/office/word/2015/wordml/symex" xmlns:wpg="http://schemas.microsoft.com/office/word/2010/wordprocessingGroup" xmlns:wpi="http://schemas.microsoft.com/office/word/2010/wordprocessingInk" xmlns:wne="http://schemas.microsoft.com/office/word/2006/wordml" xmlns:wps="http://schemas.microsoft.com/office/word/2010/wordprocessingShape" mc:Ignorable="w14 w15 w16se w16cid w16 w16cex w16sdtdh w16du wp14">
   <w:abstractNum w:abstractNumId="0" w15:restartNumberingAfterBreak="0">
     <w:nsid w:val="09A66459"/>
     <w:multiLevelType w:val="hybridMultilevel"/>
@@ -2718,29 +2702,29 @@
       </w:pPr>
     </w:lvl>
   </w:abstractNum>
-  <w:num w:numId="1">
+  <w:num w:numId="1" w16cid:durableId="1466461685">
     <w:abstractNumId w:val="0"/>
   </w:num>
-  <w:num w:numId="2">
+  <w:num w:numId="2" w16cid:durableId="1543979500">
     <w:abstractNumId w:val="3"/>
   </w:num>
-  <w:num w:numId="3">
+  <w:num w:numId="3" w16cid:durableId="1474912276">
     <w:abstractNumId w:val="4"/>
   </w:num>
-  <w:num w:numId="4">
+  <w:num w:numId="4" w16cid:durableId="694187215">
     <w:abstractNumId w:val="2"/>
   </w:num>
-  <w:num w:numId="5">
+  <w:num w:numId="5" w16cid:durableId="426077781">
     <w:abstractNumId w:val="1"/>
   </w:num>
-  <w:num w:numId="6">
+  <w:num w:numId="6" w16cid:durableId="1003901845">
     <w:abstractNumId w:val="5"/>
   </w:num>
 </w:numbering>
 </file>
 
 <file path=word/styles.xml><?xml version="1.0" encoding="utf-8"?>
-<w:styles xmlns:mc="http://schemas.openxmlformats.org/markup-compatibility/2006" xmlns:r="http://schemas.openxmlformats.org/officeDocument/2006/relationships" xmlns:w="http://schemas.openxmlformats.org/wordprocessingml/2006/main" xmlns:w14="http://schemas.microsoft.com/office/word/2010/wordml" xmlns:w15="http://schemas.microsoft.com/office/word/2012/wordml" xmlns:w16cid="http://schemas.microsoft.com/office/word/2016/wordml/cid" xmlns:w16se="http://schemas.microsoft.com/office/word/2015/wordml/symex" mc:Ignorable="w14 w15 w16se w16cid">
+<w:styles xmlns:mc="http://schemas.openxmlformats.org/markup-compatibility/2006" xmlns:r="http://schemas.openxmlformats.org/officeDocument/2006/relationships" xmlns:w="http://schemas.openxmlformats.org/wordprocessingml/2006/main" xmlns:w14="http://schemas.microsoft.com/office/word/2010/wordml" xmlns:w15="http://schemas.microsoft.com/office/word/2012/wordml" xmlns:w16cex="http://schemas.microsoft.com/office/word/2018/wordml/cex" xmlns:w16cid="http://schemas.microsoft.com/office/word/2016/wordml/cid" xmlns:w16="http://schemas.microsoft.com/office/word/2018/wordml" xmlns:w16du="http://schemas.microsoft.com/office/word/2023/wordml/word16du" xmlns:w16sdtdh="http://schemas.microsoft.com/office/word/2020/wordml/sdtdatahash" xmlns:w16se="http://schemas.microsoft.com/office/word/2015/wordml/symex" mc:Ignorable="w14 w15 w16se w16cid w16 w16cex w16sdtdh w16du">
   <w:docDefaults>
     <w:rPrDefault>
       <w:rPr>
@@ -2752,7 +2736,7 @@
     </w:rPrDefault>
     <w:pPrDefault/>
   </w:docDefaults>
-  <w:latentStyles w:defLockedState="0" w:defUIPriority="99" w:defSemiHidden="0" w:defUnhideWhenUsed="0" w:defQFormat="0" w:count="375">
+  <w:latentStyles w:defLockedState="0" w:defUIPriority="99" w:defSemiHidden="0" w:defUnhideWhenUsed="0" w:defQFormat="0" w:count="376">
     <w:lsdException w:name="Normal" w:uiPriority="0" w:qFormat="1"/>
     <w:lsdException w:name="heading 1" w:uiPriority="9" w:qFormat="1"/>
     <w:lsdException w:name="heading 2" w:semiHidden="1" w:uiPriority="9" w:unhideWhenUsed="1" w:qFormat="1"/>
@@ -3126,6 +3110,7 @@
     <w:lsdException w:name="List Table 7 Colorful Accent 6" w:uiPriority="52"/>
     <w:lsdException w:name="Mention" w:semiHidden="1" w:unhideWhenUsed="1"/>
     <w:lsdException w:name="Smart Hyperlink" w:semiHidden="1" w:unhideWhenUsed="1"/>
+    <w:lsdException w:name="Smart Link" w:semiHidden="1" w:unhideWhenUsed="1"/>
   </w:latentStyles>
   <w:style w:type="paragraph" w:default="1" w:styleId="Normal">
     <w:name w:val="Normal"/>

</xml_diff>